<commit_message>
[extensive margin] bug chase
</commit_message>
<xml_diff>
--- a/results/extensive/ext_reg_reghdfe_AN.docx
+++ b/results/extensive/ext_reg_reghdfe_AN.docx
@@ -132,7 +132,7 @@
               <w:jc w:val="right"/>
             </w:pPr>
             <w:r>
-              <w:t xml:space="preserve">dur1</w:t>
+              <w:t xml:space="preserve">Years of existence</w:t>
             </w:r>
           </w:p>
         </w:tc>
@@ -153,7 +153,7 @@
               <w:jc w:val="right"/>
             </w:pPr>
             <w:r>
-              <w:t xml:space="preserve">dur2</w:t>
+              <w:t xml:space="preserve">Time since appearance</w:t>
             </w:r>
           </w:p>
         </w:tc>
@@ -174,7 +174,7 @@
               <w:jc w:val="right"/>
             </w:pPr>
             <w:r>
-              <w:t xml:space="preserve">dur3</w:t>
+              <w:t xml:space="preserve">Time since appearance with zero trade</w:t>
             </w:r>
           </w:p>
         </w:tc>
@@ -195,7 +195,7 @@
               <w:jc w:val="right"/>
             </w:pPr>
             <w:r>
-              <w:t xml:space="preserve">dur1</w:t>
+              <w:t xml:space="preserve">Years of existence</w:t>
             </w:r>
           </w:p>
         </w:tc>
@@ -216,7 +216,7 @@
               <w:jc w:val="right"/>
             </w:pPr>
             <w:r>
-              <w:t xml:space="preserve">dur2</w:t>
+              <w:t xml:space="preserve">Time since appearance</w:t>
             </w:r>
           </w:p>
         </w:tc>
@@ -237,7 +237,7 @@
               <w:jc w:val="right"/>
             </w:pPr>
             <w:r>
-              <w:t xml:space="preserve">dur3</w:t>
+              <w:t xml:space="preserve">Time since appearance with zero trade</w:t>
             </w:r>
           </w:p>
         </w:tc>
@@ -281,7 +281,7 @@
               <w:jc w:val="right"/>
             </w:pPr>
             <w:r>
-              <w:t xml:space="preserve">-1.34e-04***</w:t>
+              <w:t xml:space="preserve">-5.36e-04***</w:t>
             </w:r>
           </w:p>
         </w:tc>
@@ -302,7 +302,7 @@
               <w:jc w:val="right"/>
             </w:pPr>
             <w:r>
-              <w:t xml:space="preserve">-1.28e-04***</w:t>
+              <w:t xml:space="preserve">-1.26e-04***</w:t>
             </w:r>
           </w:p>
         </w:tc>
@@ -323,7 +323,7 @@
               <w:jc w:val="right"/>
             </w:pPr>
             <w:r>
-              <w:t xml:space="preserve">4.49e-05***</w:t>
+              <w:t xml:space="preserve">7.57e-05***</w:t>
             </w:r>
           </w:p>
         </w:tc>
@@ -344,7 +344,7 @@
               <w:jc w:val="right"/>
             </w:pPr>
             <w:r>
-              <w:t xml:space="preserve">-1.39e-04***</w:t>
+              <w:t xml:space="preserve">-5.57e-04***</w:t>
             </w:r>
           </w:p>
         </w:tc>
@@ -365,7 +365,7 @@
               <w:jc w:val="right"/>
             </w:pPr>
             <w:r>
-              <w:t xml:space="preserve">-1.39e-04***</w:t>
+              <w:t xml:space="preserve">-1.36e-04***</w:t>
             </w:r>
           </w:p>
         </w:tc>
@@ -386,7 +386,7 @@
               <w:jc w:val="right"/>
             </w:pPr>
             <w:r>
-              <w:t xml:space="preserve">-3.05e-04***</w:t>
+              <w:t xml:space="preserve">3.74e-05***</w:t>
             </w:r>
           </w:p>
         </w:tc>
@@ -425,112 +425,112 @@
               <w:jc w:val="right"/>
             </w:pPr>
             <w:r>
-              <w:t xml:space="preserve">[-1.48e-04, -1.20e-04]</w:t>
-            </w:r>
-          </w:p>
-        </w:tc>
-        <w:tc>
-          <w:tcPr>
-            <w:tcW w:w="1337" w:type="dxa"/>
-            <w:tcBorders>
-              <w:top w:val="nil" w:color="000000"/>
-              <w:left w:val="nil" w:color="000000"/>
-              <w:bottom w:val="nil" w:color="000000"/>
-              <w:right w:val="nil" w:color="000000"/>
-            </w:tcBorders>
-            <w:vAlign w:val="bottom"/>
-          </w:tcPr>
-          <w:p>
-            <w:pPr>
-              <w:spacing w:after="0"/>
-              <w:jc w:val="right"/>
-            </w:pPr>
-            <w:r>
-              <w:t xml:space="preserve">[-1.39e-04, -1.17e-04]</w:t>
-            </w:r>
-          </w:p>
-        </w:tc>
-        <w:tc>
-          <w:tcPr>
-            <w:tcW w:w="1337" w:type="dxa"/>
-            <w:tcBorders>
-              <w:top w:val="nil" w:color="000000"/>
-              <w:left w:val="nil" w:color="000000"/>
-              <w:bottom w:val="nil" w:color="000000"/>
-              <w:right w:val="nil" w:color="000000"/>
-            </w:tcBorders>
-            <w:vAlign w:val="bottom"/>
-          </w:tcPr>
-          <w:p>
-            <w:pPr>
-              <w:spacing w:after="0"/>
-              <w:jc w:val="right"/>
-            </w:pPr>
-            <w:r>
-              <w:t xml:space="preserve">[3.85e-05,  5.13e-05]</w:t>
-            </w:r>
-          </w:p>
-        </w:tc>
-        <w:tc>
-          <w:tcPr>
-            <w:tcW w:w="1337" w:type="dxa"/>
-            <w:tcBorders>
-              <w:top w:val="nil" w:color="000000"/>
-              <w:left w:val="nil" w:color="000000"/>
-              <w:bottom w:val="nil" w:color="000000"/>
-              <w:right w:val="nil" w:color="000000"/>
-            </w:tcBorders>
-            <w:vAlign w:val="bottom"/>
-          </w:tcPr>
-          <w:p>
-            <w:pPr>
-              <w:spacing w:after="0"/>
-              <w:jc w:val="right"/>
-            </w:pPr>
-            <w:r>
-              <w:t xml:space="preserve">[-1.54e-04, -1.25e-04]</w:t>
-            </w:r>
-          </w:p>
-        </w:tc>
-        <w:tc>
-          <w:tcPr>
-            <w:tcW w:w="1337" w:type="dxa"/>
-            <w:tcBorders>
-              <w:top w:val="nil" w:color="000000"/>
-              <w:left w:val="nil" w:color="000000"/>
-              <w:bottom w:val="nil" w:color="000000"/>
-              <w:right w:val="nil" w:color="000000"/>
-            </w:tcBorders>
-            <w:vAlign w:val="bottom"/>
-          </w:tcPr>
-          <w:p>
-            <w:pPr>
-              <w:spacing w:after="0"/>
-              <w:jc w:val="right"/>
-            </w:pPr>
-            <w:r>
-              <w:t xml:space="preserve">[-1.50e-04, -1.27e-04]</w:t>
-            </w:r>
-          </w:p>
-        </w:tc>
-        <w:tc>
-          <w:tcPr>
-            <w:tcW w:w="1337" w:type="dxa"/>
-            <w:tcBorders>
-              <w:top w:val="nil" w:color="000000"/>
-              <w:left w:val="nil" w:color="000000"/>
-              <w:bottom w:val="nil" w:color="000000"/>
-              <w:right w:val="nil" w:color="000000"/>
-            </w:tcBorders>
-            <w:vAlign w:val="bottom"/>
-          </w:tcPr>
-          <w:p>
-            <w:pPr>
-              <w:spacing w:after="0"/>
-              <w:jc w:val="right"/>
-            </w:pPr>
-            <w:r>
-              <w:t xml:space="preserve">[-3.12e-04, -2.99e-04]</w:t>
+              <w:t xml:space="preserve">[-5.90e-04, -4.81e-04]</w:t>
+            </w:r>
+          </w:p>
+        </w:tc>
+        <w:tc>
+          <w:tcPr>
+            <w:tcW w:w="1337" w:type="dxa"/>
+            <w:tcBorders>
+              <w:top w:val="nil" w:color="000000"/>
+              <w:left w:val="nil" w:color="000000"/>
+              <w:bottom w:val="nil" w:color="000000"/>
+              <w:right w:val="nil" w:color="000000"/>
+            </w:tcBorders>
+            <w:vAlign w:val="bottom"/>
+          </w:tcPr>
+          <w:p>
+            <w:pPr>
+              <w:spacing w:after="0"/>
+              <w:jc w:val="right"/>
+            </w:pPr>
+            <w:r>
+              <w:t xml:space="preserve">[-1.36e-04, -1.15e-04]</w:t>
+            </w:r>
+          </w:p>
+        </w:tc>
+        <w:tc>
+          <w:tcPr>
+            <w:tcW w:w="1337" w:type="dxa"/>
+            <w:tcBorders>
+              <w:top w:val="nil" w:color="000000"/>
+              <w:left w:val="nil" w:color="000000"/>
+              <w:bottom w:val="nil" w:color="000000"/>
+              <w:right w:val="nil" w:color="000000"/>
+            </w:tcBorders>
+            <w:vAlign w:val="bottom"/>
+          </w:tcPr>
+          <w:p>
+            <w:pPr>
+              <w:spacing w:after="0"/>
+              <w:jc w:val="right"/>
+            </w:pPr>
+            <w:r>
+              <w:t xml:space="preserve">[7.31e-05,  7.82e-05]</w:t>
+            </w:r>
+          </w:p>
+        </w:tc>
+        <w:tc>
+          <w:tcPr>
+            <w:tcW w:w="1337" w:type="dxa"/>
+            <w:tcBorders>
+              <w:top w:val="nil" w:color="000000"/>
+              <w:left w:val="nil" w:color="000000"/>
+              <w:bottom w:val="nil" w:color="000000"/>
+              <w:right w:val="nil" w:color="000000"/>
+            </w:tcBorders>
+            <w:vAlign w:val="bottom"/>
+          </w:tcPr>
+          <w:p>
+            <w:pPr>
+              <w:spacing w:after="0"/>
+              <w:jc w:val="right"/>
+            </w:pPr>
+            <w:r>
+              <w:t xml:space="preserve">[-6.15e-04, -4.99e-04]</w:t>
+            </w:r>
+          </w:p>
+        </w:tc>
+        <w:tc>
+          <w:tcPr>
+            <w:tcW w:w="1337" w:type="dxa"/>
+            <w:tcBorders>
+              <w:top w:val="nil" w:color="000000"/>
+              <w:left w:val="nil" w:color="000000"/>
+              <w:bottom w:val="nil" w:color="000000"/>
+              <w:right w:val="nil" w:color="000000"/>
+            </w:tcBorders>
+            <w:vAlign w:val="bottom"/>
+          </w:tcPr>
+          <w:p>
+            <w:pPr>
+              <w:spacing w:after="0"/>
+              <w:jc w:val="right"/>
+            </w:pPr>
+            <w:r>
+              <w:t xml:space="preserve">[-1.48e-04, -1.25e-04]</w:t>
+            </w:r>
+          </w:p>
+        </w:tc>
+        <w:tc>
+          <w:tcPr>
+            <w:tcW w:w="1337" w:type="dxa"/>
+            <w:tcBorders>
+              <w:top w:val="nil" w:color="000000"/>
+              <w:left w:val="nil" w:color="000000"/>
+              <w:bottom w:val="nil" w:color="000000"/>
+              <w:right w:val="nil" w:color="000000"/>
+            </w:tcBorders>
+            <w:vAlign w:val="bottom"/>
+          </w:tcPr>
+          <w:p>
+            <w:pPr>
+              <w:spacing w:after="0"/>
+              <w:jc w:val="right"/>
+            </w:pPr>
+            <w:r>
+              <w:t xml:space="preserve">[2.50e-05,  4.98e-05]</w:t>
             </w:r>
           </w:p>
         </w:tc>
@@ -688,7 +688,7 @@
               <w:jc w:val="right"/>
             </w:pPr>
             <w:r>
-              <w:t xml:space="preserve">1.44e-06***</w:t>
+              <w:t xml:space="preserve">2.30e-05***</w:t>
             </w:r>
           </w:p>
         </w:tc>
@@ -730,28 +730,28 @@
               <w:jc w:val="right"/>
             </w:pPr>
             <w:r>
-              <w:t xml:space="preserve">-2.15e-08***</w:t>
-            </w:r>
-          </w:p>
-        </w:tc>
-        <w:tc>
-          <w:tcPr>
-            <w:tcW w:w="1337" w:type="dxa"/>
-            <w:tcBorders>
-              <w:top w:val="nil" w:color="000000"/>
-              <w:left w:val="nil" w:color="000000"/>
-              <w:bottom w:val="nil" w:color="000000"/>
-              <w:right w:val="nil" w:color="000000"/>
-            </w:tcBorders>
-            <w:vAlign w:val="bottom"/>
-          </w:tcPr>
-          <w:p>
-            <w:pPr>
-              <w:spacing w:after="0"/>
-              <w:jc w:val="right"/>
-            </w:pPr>
-            <w:r>
-              <w:t xml:space="preserve">1.47e-06***</w:t>
+              <w:t xml:space="preserve">-5.77e-08***</w:t>
+            </w:r>
+          </w:p>
+        </w:tc>
+        <w:tc>
+          <w:tcPr>
+            <w:tcW w:w="1337" w:type="dxa"/>
+            <w:tcBorders>
+              <w:top w:val="nil" w:color="000000"/>
+              <w:left w:val="nil" w:color="000000"/>
+              <w:bottom w:val="nil" w:color="000000"/>
+              <w:right w:val="nil" w:color="000000"/>
+            </w:tcBorders>
+            <w:vAlign w:val="bottom"/>
+          </w:tcPr>
+          <w:p>
+            <w:pPr>
+              <w:spacing w:after="0"/>
+              <w:jc w:val="right"/>
+            </w:pPr>
+            <w:r>
+              <w:t xml:space="preserve">2.35e-05***</w:t>
             </w:r>
           </w:p>
         </w:tc>
@@ -793,7 +793,7 @@
               <w:jc w:val="right"/>
             </w:pPr>
             <w:r>
-              <w:t xml:space="preserve">1.62e-07***</w:t>
+              <w:t xml:space="preserve">4.26e-07***</w:t>
             </w:r>
           </w:p>
         </w:tc>
@@ -832,7 +832,7 @@
               <w:jc w:val="right"/>
             </w:pPr>
             <w:r>
-              <w:t xml:space="preserve">[1.29e-06,  1.59e-06]</w:t>
+              <w:t xml:space="preserve">[2.06e-05,  2.54e-05]</w:t>
             </w:r>
           </w:p>
         </w:tc>
@@ -874,28 +874,28 @@
               <w:jc w:val="right"/>
             </w:pPr>
             <w:r>
-              <w:t xml:space="preserve">[-2.49e-08, -1.82e-08]</w:t>
-            </w:r>
-          </w:p>
-        </w:tc>
-        <w:tc>
-          <w:tcPr>
-            <w:tcW w:w="1337" w:type="dxa"/>
-            <w:tcBorders>
-              <w:top w:val="nil" w:color="000000"/>
-              <w:left w:val="nil" w:color="000000"/>
-              <w:bottom w:val="nil" w:color="000000"/>
-              <w:right w:val="nil" w:color="000000"/>
-            </w:tcBorders>
-            <w:vAlign w:val="bottom"/>
-          </w:tcPr>
-          <w:p>
-            <w:pPr>
-              <w:spacing w:after="0"/>
-              <w:jc w:val="right"/>
-            </w:pPr>
-            <w:r>
-              <w:t xml:space="preserve">[1.31e-06,  1.63e-06]</w:t>
+              <w:t xml:space="preserve">[-9.71e-08, -1.84e-08]</w:t>
+            </w:r>
+          </w:p>
+        </w:tc>
+        <w:tc>
+          <w:tcPr>
+            <w:tcW w:w="1337" w:type="dxa"/>
+            <w:tcBorders>
+              <w:top w:val="nil" w:color="000000"/>
+              <w:left w:val="nil" w:color="000000"/>
+              <w:bottom w:val="nil" w:color="000000"/>
+              <w:right w:val="nil" w:color="000000"/>
+            </w:tcBorders>
+            <w:vAlign w:val="bottom"/>
+          </w:tcPr>
+          <w:p>
+            <w:pPr>
+              <w:spacing w:after="0"/>
+              <w:jc w:val="right"/>
+            </w:pPr>
+            <w:r>
+              <w:t xml:space="preserve">[2.09e-05,  2.61e-05]</w:t>
             </w:r>
           </w:p>
         </w:tc>
@@ -937,7 +937,7 @@
               <w:jc w:val="right"/>
             </w:pPr>
             <w:r>
-              <w:t xml:space="preserve">[1.59e-07,  1.65e-07]</w:t>
+              <w:t xml:space="preserve">[2.93e-07,  5.59e-07]</w:t>
             </w:r>
           </w:p>
         </w:tc>
@@ -1137,7 +1137,7 @@
               <w:jc w:val="right"/>
             </w:pPr>
             <w:r>
-              <w:t xml:space="preserve">1.16e-05**</w:t>
+              <w:t xml:space="preserve">-4.26e-05***</w:t>
             </w:r>
           </w:p>
         </w:tc>
@@ -1200,7 +1200,7 @@
               <w:jc w:val="right"/>
             </w:pPr>
             <w:r>
-              <w:t xml:space="preserve">-1.26e-05**</w:t>
+              <w:t xml:space="preserve">-4.06e-05***</w:t>
             </w:r>
           </w:p>
         </w:tc>
@@ -1281,7 +1281,7 @@
               <w:jc w:val="right"/>
             </w:pPr>
             <w:r>
-              <w:t xml:space="preserve">[6.00e-07,  2.26e-05]</w:t>
+              <w:t xml:space="preserve">[-5.54e-05, -2.97e-05]</w:t>
             </w:r>
           </w:p>
         </w:tc>
@@ -1344,7 +1344,7 @@
               <w:jc w:val="right"/>
             </w:pPr>
             <w:r>
-              <w:t xml:space="preserve">[-2.51e-05, -1.44e-07]</w:t>
+              <w:t xml:space="preserve">[-5.46e-05, -2.66e-05]</w:t>
             </w:r>
           </w:p>
         </w:tc>
@@ -1544,6 +1544,27 @@
               <w:jc w:val="right"/>
             </w:pPr>
             <w:r>
+              <w:t xml:space="preserve">-0.005***</w:t>
+            </w:r>
+          </w:p>
+        </w:tc>
+        <w:tc>
+          <w:tcPr>
+            <w:tcW w:w="1337" w:type="dxa"/>
+            <w:tcBorders>
+              <w:top w:val="nil" w:color="000000"/>
+              <w:left w:val="nil" w:color="000000"/>
+              <w:bottom w:val="nil" w:color="000000"/>
+              <w:right w:val="nil" w:color="000000"/>
+            </w:tcBorders>
+            <w:vAlign w:val="bottom"/>
+          </w:tcPr>
+          <w:p>
+            <w:pPr>
+              <w:spacing w:after="0"/>
+              <w:jc w:val="right"/>
+            </w:pPr>
+            <w:r>
               <w:t xml:space="preserve">-0.006***</w:t>
             </w:r>
           </w:p>
@@ -1586,28 +1607,7 @@
               <w:jc w:val="right"/>
             </w:pPr>
             <w:r>
-              <w:t xml:space="preserve">-0.006***</w:t>
-            </w:r>
-          </w:p>
-        </w:tc>
-        <w:tc>
-          <w:tcPr>
-            <w:tcW w:w="1337" w:type="dxa"/>
-            <w:tcBorders>
-              <w:top w:val="nil" w:color="000000"/>
-              <w:left w:val="nil" w:color="000000"/>
-              <w:bottom w:val="nil" w:color="000000"/>
-              <w:right w:val="nil" w:color="000000"/>
-            </w:tcBorders>
-            <w:vAlign w:val="bottom"/>
-          </w:tcPr>
-          <w:p>
-            <w:pPr>
-              <w:spacing w:after="0"/>
-              <w:jc w:val="right"/>
-            </w:pPr>
-            <w:r>
-              <w:t xml:space="preserve">-0.006***</w:t>
+              <w:t xml:space="preserve">-0.005***</w:t>
             </w:r>
           </w:p>
         </w:tc>
@@ -1951,6 +1951,27 @@
               <w:jc w:val="right"/>
             </w:pPr>
             <w:r>
+              <w:t xml:space="preserve">-0.010***</w:t>
+            </w:r>
+          </w:p>
+        </w:tc>
+        <w:tc>
+          <w:tcPr>
+            <w:tcW w:w="1337" w:type="dxa"/>
+            <w:tcBorders>
+              <w:top w:val="nil" w:color="000000"/>
+              <w:left w:val="nil" w:color="000000"/>
+              <w:bottom w:val="nil" w:color="000000"/>
+              <w:right w:val="nil" w:color="000000"/>
+            </w:tcBorders>
+            <w:vAlign w:val="bottom"/>
+          </w:tcPr>
+          <w:p>
+            <w:pPr>
+              <w:spacing w:after="0"/>
+              <w:jc w:val="right"/>
+            </w:pPr>
+            <w:r>
               <w:t xml:space="preserve">-0.008***</w:t>
             </w:r>
           </w:p>
@@ -1993,28 +2014,7 @@
               <w:jc w:val="right"/>
             </w:pPr>
             <w:r>
-              <w:t xml:space="preserve">-0.008***</w:t>
-            </w:r>
-          </w:p>
-        </w:tc>
-        <w:tc>
-          <w:tcPr>
-            <w:tcW w:w="1337" w:type="dxa"/>
-            <w:tcBorders>
-              <w:top w:val="nil" w:color="000000"/>
-              <w:left w:val="nil" w:color="000000"/>
-              <w:bottom w:val="nil" w:color="000000"/>
-              <w:right w:val="nil" w:color="000000"/>
-            </w:tcBorders>
-            <w:vAlign w:val="bottom"/>
-          </w:tcPr>
-          <w:p>
-            <w:pPr>
-              <w:spacing w:after="0"/>
-              <w:jc w:val="right"/>
-            </w:pPr>
-            <w:r>
-              <w:t xml:space="preserve">-0.008***</w:t>
+              <w:t xml:space="preserve">-0.010***</w:t>
             </w:r>
           </w:p>
         </w:tc>
@@ -2095,6 +2095,27 @@
               <w:jc w:val="right"/>
             </w:pPr>
             <w:r>
+              <w:t xml:space="preserve">[-0.010,  -0.010]</w:t>
+            </w:r>
+          </w:p>
+        </w:tc>
+        <w:tc>
+          <w:tcPr>
+            <w:tcW w:w="1337" w:type="dxa"/>
+            <w:tcBorders>
+              <w:top w:val="nil" w:color="000000"/>
+              <w:left w:val="nil" w:color="000000"/>
+              <w:bottom w:val="nil" w:color="000000"/>
+              <w:right w:val="nil" w:color="000000"/>
+            </w:tcBorders>
+            <w:vAlign w:val="bottom"/>
+          </w:tcPr>
+          <w:p>
+            <w:pPr>
+              <w:spacing w:after="0"/>
+              <w:jc w:val="right"/>
+            </w:pPr>
+            <w:r>
               <w:t xml:space="preserve">[-0.008,  -0.008]</w:t>
             </w:r>
           </w:p>
@@ -2137,28 +2158,7 @@
               <w:jc w:val="right"/>
             </w:pPr>
             <w:r>
-              <w:t xml:space="preserve">[-0.008,  -0.008]</w:t>
-            </w:r>
-          </w:p>
-        </w:tc>
-        <w:tc>
-          <w:tcPr>
-            <w:tcW w:w="1337" w:type="dxa"/>
-            <w:tcBorders>
-              <w:top w:val="nil" w:color="000000"/>
-              <w:left w:val="nil" w:color="000000"/>
-              <w:bottom w:val="nil" w:color="000000"/>
-              <w:right w:val="nil" w:color="000000"/>
-            </w:tcBorders>
-            <w:vAlign w:val="bottom"/>
-          </w:tcPr>
-          <w:p>
-            <w:pPr>
-              <w:spacing w:after="0"/>
-              <w:jc w:val="right"/>
-            </w:pPr>
-            <w:r>
-              <w:t xml:space="preserve">[-0.008,  -0.008]</w:t>
+              <w:t xml:space="preserve">[-0.010,  -0.010]</w:t>
             </w:r>
           </w:p>
         </w:tc>
@@ -2358,7 +2358,7 @@
               <w:jc w:val="right"/>
             </w:pPr>
             <w:r>
-              <w:t xml:space="preserve">0.006***</w:t>
+              <w:t xml:space="preserve">0.007***</w:t>
             </w:r>
           </w:p>
         </w:tc>
@@ -2502,27 +2502,6 @@
               <w:jc w:val="right"/>
             </w:pPr>
             <w:r>
-              <w:t xml:space="preserve">[0.006,   0.007]</w:t>
-            </w:r>
-          </w:p>
-        </w:tc>
-        <w:tc>
-          <w:tcPr>
-            <w:tcW w:w="1337" w:type="dxa"/>
-            <w:tcBorders>
-              <w:top w:val="nil" w:color="000000"/>
-              <w:left w:val="nil" w:color="000000"/>
-              <w:bottom w:val="nil" w:color="000000"/>
-              <w:right w:val="nil" w:color="000000"/>
-            </w:tcBorders>
-            <w:vAlign w:val="bottom"/>
-          </w:tcPr>
-          <w:p>
-            <w:pPr>
-              <w:spacing w:after="0"/>
-              <w:jc w:val="right"/>
-            </w:pPr>
-            <w:r>
               <w:t xml:space="preserve">[0.007,   0.008]</w:t>
             </w:r>
           </w:p>
@@ -2565,7 +2544,28 @@
               <w:jc w:val="right"/>
             </w:pPr>
             <w:r>
-              <w:t xml:space="preserve">[0.008,   0.008]</w:t>
+              <w:t xml:space="preserve">[0.007,   0.008]</w:t>
+            </w:r>
+          </w:p>
+        </w:tc>
+        <w:tc>
+          <w:tcPr>
+            <w:tcW w:w="1337" w:type="dxa"/>
+            <w:tcBorders>
+              <w:top w:val="nil" w:color="000000"/>
+              <w:left w:val="nil" w:color="000000"/>
+              <w:bottom w:val="nil" w:color="000000"/>
+              <w:right w:val="nil" w:color="000000"/>
+            </w:tcBorders>
+            <w:vAlign w:val="bottom"/>
+          </w:tcPr>
+          <w:p>
+            <w:pPr>
+              <w:spacing w:after="0"/>
+              <w:jc w:val="right"/>
+            </w:pPr>
+            <w:r>
+              <w:t xml:space="preserve">[0.008,   0.009]</w:t>
             </w:r>
           </w:p>
         </w:tc>
@@ -2828,7 +2828,7 @@
               <w:jc w:val="right"/>
             </w:pPr>
             <w:r>
-              <w:t xml:space="preserve">0.030***</w:t>
+              <w:t xml:space="preserve">0.029***</w:t>
             </w:r>
           </w:p>
         </w:tc>
@@ -2909,7 +2909,7 @@
               <w:jc w:val="right"/>
             </w:pPr>
             <w:r>
-              <w:t xml:space="preserve">[0.026,   0.037]</w:t>
+              <w:t xml:space="preserve">[0.025,   0.039]</w:t>
             </w:r>
           </w:p>
         </w:tc>
@@ -2972,7 +2972,7 @@
               <w:jc w:val="right"/>
             </w:pPr>
             <w:r>
-              <w:t xml:space="preserve">[0.024,   0.036]</w:t>
+              <w:t xml:space="preserve">[0.022,   0.036]</w:t>
             </w:r>
           </w:p>
         </w:tc>
@@ -3172,7 +3172,7 @@
               <w:jc w:val="right"/>
             </w:pPr>
             <w:r>
-              <w:t xml:space="preserve">-0.002***</w:t>
+              <w:t xml:space="preserve">-0.005***</w:t>
             </w:r>
           </w:p>
         </w:tc>
@@ -3235,7 +3235,7 @@
               <w:jc w:val="right"/>
             </w:pPr>
             <w:r>
-              <w:t xml:space="preserve">-0.002**</w:t>
+              <w:t xml:space="preserve">-0.003***</w:t>
             </w:r>
           </w:p>
         </w:tc>
@@ -3316,6 +3316,27 @@
               <w:jc w:val="right"/>
             </w:pPr>
             <w:r>
+              <w:t xml:space="preserve">[-0.007,  -0.003]</w:t>
+            </w:r>
+          </w:p>
+        </w:tc>
+        <w:tc>
+          <w:tcPr>
+            <w:tcW w:w="1337" w:type="dxa"/>
+            <w:tcBorders>
+              <w:top w:val="nil" w:color="000000"/>
+              <w:left w:val="nil" w:color="000000"/>
+              <w:bottom w:val="nil" w:color="000000"/>
+              <w:right w:val="nil" w:color="000000"/>
+            </w:tcBorders>
+            <w:vAlign w:val="bottom"/>
+          </w:tcPr>
+          <w:p>
+            <w:pPr>
+              <w:spacing w:after="0"/>
+              <w:jc w:val="right"/>
+            </w:pPr>
+            <w:r>
               <w:t xml:space="preserve">[-0.004,  -0.001]</w:t>
             </w:r>
           </w:p>
@@ -3358,28 +3379,7 @@
               <w:jc w:val="right"/>
             </w:pPr>
             <w:r>
-              <w:t xml:space="preserve">[-0.004,  -0.001]</w:t>
-            </w:r>
-          </w:p>
-        </w:tc>
-        <w:tc>
-          <w:tcPr>
-            <w:tcW w:w="1337" w:type="dxa"/>
-            <w:tcBorders>
-              <w:top w:val="nil" w:color="000000"/>
-              <w:left w:val="nil" w:color="000000"/>
-              <w:bottom w:val="nil" w:color="000000"/>
-              <w:right w:val="nil" w:color="000000"/>
-            </w:tcBorders>
-            <w:vAlign w:val="bottom"/>
-          </w:tcPr>
-          <w:p>
-            <w:pPr>
-              <w:spacing w:after="0"/>
-              <w:jc w:val="right"/>
-            </w:pPr>
-            <w:r>
-              <w:t xml:space="preserve">[-0.003,  -0.000]</w:t>
+              <w:t xml:space="preserve">[-0.005,  -0.001]</w:t>
             </w:r>
           </w:p>
         </w:tc>
@@ -3579,7 +3579,7 @@
               <w:jc w:val="right"/>
             </w:pPr>
             <w:r>
-              <w:t xml:space="preserve">0.003***</w:t>
+              <w:t xml:space="preserve">0.007***</w:t>
             </w:r>
           </w:p>
         </w:tc>
@@ -3642,7 +3642,7 @@
               <w:jc w:val="right"/>
             </w:pPr>
             <w:r>
-              <w:t xml:space="preserve">0.005***</w:t>
+              <w:t xml:space="preserve">0.006***</w:t>
             </w:r>
           </w:p>
         </w:tc>
@@ -3723,7 +3723,7 @@
               <w:jc w:val="right"/>
             </w:pPr>
             <w:r>
-              <w:t xml:space="preserve">[0.003,   0.004]</w:t>
+              <w:t xml:space="preserve">[0.007,   0.007]</w:t>
             </w:r>
           </w:p>
         </w:tc>
@@ -3786,7 +3786,7 @@
               <w:jc w:val="right"/>
             </w:pPr>
             <w:r>
-              <w:t xml:space="preserve">[0.005,   0.005]</w:t>
+              <w:t xml:space="preserve">[0.006,   0.006]</w:t>
             </w:r>
           </w:p>
         </w:tc>
@@ -3986,7 +3986,7 @@
               <w:jc w:val="right"/>
             </w:pPr>
             <w:r>
-              <w:t xml:space="preserve">0.018***</w:t>
+              <w:t xml:space="preserve">0.019***</w:t>
             </w:r>
           </w:p>
         </w:tc>
@@ -4130,6 +4130,27 @@
               <w:jc w:val="right"/>
             </w:pPr>
             <w:r>
+              <w:t xml:space="preserve">[0.014,   0.024]</w:t>
+            </w:r>
+          </w:p>
+        </w:tc>
+        <w:tc>
+          <w:tcPr>
+            <w:tcW w:w="1337" w:type="dxa"/>
+            <w:tcBorders>
+              <w:top w:val="nil" w:color="000000"/>
+              <w:left w:val="nil" w:color="000000"/>
+              <w:bottom w:val="nil" w:color="000000"/>
+              <w:right w:val="nil" w:color="000000"/>
+            </w:tcBorders>
+            <w:vAlign w:val="bottom"/>
+          </w:tcPr>
+          <w:p>
+            <w:pPr>
+              <w:spacing w:after="0"/>
+              <w:jc w:val="right"/>
+            </w:pPr>
+            <w:r>
               <w:t xml:space="preserve">[0.014,   0.022]</w:t>
             </w:r>
           </w:p>
@@ -4172,28 +4193,7 @@
               <w:jc w:val="right"/>
             </w:pPr>
             <w:r>
-              <w:t xml:space="preserve">[0.014,   0.022]</w:t>
-            </w:r>
-          </w:p>
-        </w:tc>
-        <w:tc>
-          <w:tcPr>
-            <w:tcW w:w="1337" w:type="dxa"/>
-            <w:tcBorders>
-              <w:top w:val="nil" w:color="000000"/>
-              <w:left w:val="nil" w:color="000000"/>
-              <w:bottom w:val="nil" w:color="000000"/>
-              <w:right w:val="nil" w:color="000000"/>
-            </w:tcBorders>
-            <w:vAlign w:val="bottom"/>
-          </w:tcPr>
-          <w:p>
-            <w:pPr>
-              <w:spacing w:after="0"/>
-              <w:jc w:val="right"/>
-            </w:pPr>
-            <w:r>
-              <w:t xml:space="preserve">[0.014,   0.022]</w:t>
+              <w:t xml:space="preserve">[0.013,   0.023]</w:t>
             </w:r>
           </w:p>
         </w:tc>
@@ -4393,7 +4393,7 @@
               <w:jc w:val="right"/>
             </w:pPr>
             <w:r>
-              <w:t xml:space="preserve">6,190,724</w:t>
+              <w:t xml:space="preserve">5,139,614</w:t>
             </w:r>
           </w:p>
         </w:tc>
@@ -4456,7 +4456,7 @@
               <w:jc w:val="right"/>
             </w:pPr>
             <w:r>
-              <w:t xml:space="preserve">6,030,436</w:t>
+              <w:t xml:space="preserve">5,058,235</w:t>
             </w:r>
           </w:p>
         </w:tc>
@@ -4656,7 +4656,7 @@
               <w:jc w:val="right"/>
             </w:pPr>
             <w:r>
-              <w:t xml:space="preserve">240,905</w:t>
+              <w:t xml:space="preserve">166,232</w:t>
             </w:r>
           </w:p>
         </w:tc>
@@ -4719,7 +4719,7 @@
               <w:jc w:val="right"/>
             </w:pPr>
             <w:r>
-              <w:t xml:space="preserve">240,117</w:t>
+              <w:t xml:space="preserve">165,962</w:t>
             </w:r>
           </w:p>
         </w:tc>
@@ -4919,7 +4919,7 @@
               <w:jc w:val="right"/>
             </w:pPr>
             <w:r>
-              <w:t xml:space="preserve">0.017</w:t>
+              <w:t xml:space="preserve">0.016</w:t>
             </w:r>
           </w:p>
         </w:tc>
@@ -4982,7 +4982,7 @@
               <w:jc w:val="right"/>
             </w:pPr>
             <w:r>
-              <w:t xml:space="preserve">0.022</w:t>
+              <w:t xml:space="preserve">0.018</w:t>
             </w:r>
           </w:p>
         </w:tc>

</xml_diff>